<commit_message>
Thêm vài field vào database
</commit_message>
<xml_diff>
--- a/Online Bookstore Website/documents/WST.docx
+++ b/Online Bookstore Website/documents/WST.docx
@@ -3305,7 +3305,7 @@
           <w14:ligatures w14:val="standardContextual"/>
         </w:rPr>
         <w:drawing>
-          <wp:anchor distT="0" distB="0" distL="114300" distR="114300" simplePos="0" relativeHeight="251661312" behindDoc="0" locked="0" layoutInCell="1" allowOverlap="1" wp14:anchorId="7771190B" wp14:editId="0FA956EF">
+          <wp:anchor distT="0" distB="0" distL="114300" distR="114300" simplePos="0" relativeHeight="251661312" behindDoc="0" locked="0" layoutInCell="1" allowOverlap="1" wp14:anchorId="7771190B" wp14:editId="6700D173">
             <wp:simplePos x="0" y="0"/>
             <wp:positionH relativeFrom="column">
               <wp:posOffset>-3810</wp:posOffset>
@@ -5294,9 +5294,71 @@
         <w:t>Website</w:t>
       </w:r>
     </w:p>
+    <w:p>
+      <w:pPr>
+        <w:spacing w:line="278" w:lineRule="auto"/>
+        <w:rPr>
+          <w:rFonts w:ascii="Times New Roman" w:hAnsi="Times New Roman" w:cs="Times New Roman"/>
+          <w:b/>
+          <w:bCs/>
+          <w:sz w:val="28"/>
+          <w:szCs w:val="28"/>
+        </w:rPr>
+      </w:pPr>
+      <w:hyperlink r:id="rId16" w:history="1">
+        <w:r>
+          <w:rPr>
+            <w:rStyle w:val="Hyperlink"/>
+            <w:rFonts w:ascii="Times New Roman" w:hAnsi="Times New Roman" w:cs="Times New Roman"/>
+            <w:b/>
+            <w:bCs/>
+            <w:sz w:val="28"/>
+            <w:szCs w:val="28"/>
+          </w:rPr>
+          <w:t>https://www.fahasa.com/</w:t>
+        </w:r>
+      </w:hyperlink>
+    </w:p>
+    <w:p>
+      <w:pPr>
+        <w:spacing w:line="278" w:lineRule="auto"/>
+        <w:rPr>
+          <w:rFonts w:ascii="Times New Roman" w:hAnsi="Times New Roman" w:cs="Times New Roman"/>
+          <w:b/>
+          <w:bCs/>
+          <w:sz w:val="28"/>
+          <w:szCs w:val="28"/>
+        </w:rPr>
+      </w:pPr>
+      <w:hyperlink r:id="rId17" w:history="1">
+        <w:r>
+          <w:rPr>
+            <w:rStyle w:val="Hyperlink"/>
+            <w:rFonts w:ascii="Times New Roman" w:hAnsi="Times New Roman" w:cs="Times New Roman"/>
+            <w:b/>
+            <w:bCs/>
+            <w:sz w:val="28"/>
+            <w:szCs w:val="28"/>
+          </w:rPr>
+          <w:t>https://sites.google.com/view/kho-sach-online/trang-ch%E1%BB%A7</w:t>
+        </w:r>
+      </w:hyperlink>
+    </w:p>
+    <w:p>
+      <w:pPr>
+        <w:spacing w:line="278" w:lineRule="auto"/>
+        <w:rPr>
+          <w:rFonts w:ascii="Times New Roman" w:hAnsi="Times New Roman" w:cs="Times New Roman"/>
+          <w:b/>
+          <w:bCs/>
+          <w:sz w:val="28"/>
+          <w:szCs w:val="28"/>
+        </w:rPr>
+      </w:pPr>
+    </w:p>
     <w:sectPr>
-      <w:headerReference w:type="default" r:id="rId16"/>
-      <w:footerReference w:type="default" r:id="rId17"/>
+      <w:headerReference w:type="default" r:id="rId18"/>
+      <w:footerReference w:type="default" r:id="rId19"/>
       <w:pgSz w:w="11907" w:h="16840" w:code="9"/>
       <w:pgMar w:top="1134" w:right="851" w:bottom="1134" w:left="1701" w:header="720" w:footer="720" w:gutter="0"/>
       <w:pgBorders w:display="firstPage">
@@ -8704,9 +8766,11 @@
     <w:rsid w:val="00222AE7"/>
     <w:rsid w:val="00516AF9"/>
     <w:rsid w:val="00567176"/>
+    <w:rsid w:val="00802F1B"/>
     <w:rsid w:val="00A47EA9"/>
     <w:rsid w:val="00CE0A2D"/>
     <w:rsid w:val="00D53811"/>
+    <w:rsid w:val="00EA62D2"/>
   </w:rsids>
   <m:mathPr>
     <m:mathFont m:val="Cambria Math"/>

</xml_diff>